<commit_message>
Organize GSN community setup pack documents
</commit_message>
<xml_diff>
--- a/docs/gsn-user-guide/real-life-capability-bank/GSN_IN_REAL_LIFE_AUDIENCE_PICK_LISTS.docx
+++ b/docs/gsn-user-guide/real-life-capability-bank/GSN_IN_REAL_LIFE_AUDIENCE_PICK_LISTS.docx
@@ -3,8 +3,32 @@
 <w:document xmlns:wpc="http://schemas.microsoft.com/office/word/2010/wordprocessingCanvas" xmlns:mo="http://schemas.microsoft.com/office/mac/office/2008/main" xmlns:mc="http://schemas.openxmlformats.org/markup-compatibility/2006" xmlns:mv="urn:schemas-microsoft-com:mac:vml" xmlns:o="urn:schemas-microsoft-com:office:office" xmlns:r="http://schemas.openxmlformats.org/officeDocument/2006/relationships" xmlns:m="http://schemas.openxmlformats.org/officeDocument/2006/math" xmlns:v="urn:schemas-microsoft-com:vml" xmlns:wp14="http://schemas.microsoft.com/office/word/2010/wordprocessingDrawing" xmlns:wp="http://schemas.openxmlformats.org/drawingml/2006/wordprocessingDrawing" xmlns:w10="urn:schemas-microsoft-com:office:word" xmlns:w="http://schemas.openxmlformats.org/wordprocessingml/2006/main" xmlns:w14="http://schemas.microsoft.com/office/word/2010/wordml" xmlns:wpg="http://schemas.microsoft.com/office/word/2010/wordprocessingGroup" xmlns:wpi="http://schemas.microsoft.com/office/word/2010/wordprocessingInk" xmlns:wne="http://schemas.microsoft.com/office/word/2006/wordml" xmlns:wps="http://schemas.microsoft.com/office/word/2010/wordprocessingShape" mc:Ignorable="w14 wp14">
   <w:body>
     <w:p>
+      <w:pPr>
+        <w:jc w:val="center"/>
+      </w:pPr>
       <w:r>
-        <w:t>﻿# GSN in Real Life: Audience Pick Lists</w:t>
+        <w:rPr>
+          <w:rFonts w:ascii="Aptos Display" w:hAnsi="Aptos Display"/>
+          <w:b/>
+          <w:color w:val="0B2545"/>
+          <w:sz w:val="44"/>
+        </w:rPr>
+        <w:t>GSN Community Setup Pack: Audience Pick Lists for Community Setup (2026-09-14)</w:t>
+      </w:r>
+    </w:p>
+    <w:p>
+      <w:r>
+        <w:t>Document date: 2026-09-14</w:t>
+      </w:r>
+    </w:p>
+    <w:p>
+      <w:r>
+        <w:t>Pack: GSN Community Setup Pack</w:t>
+      </w:r>
+    </w:p>
+    <w:p>
+      <w:r>
+        <w:t>Authenticity mark: GSN Original Community Setup Material | Source-controlled in gmfn_mvp/docs | Document date: 2026-09-14</w:t>
       </w:r>
     </w:p>
     <w:p>
@@ -22,6 +46,9 @@
         <w:pStyle w:val="Heading1"/>
       </w:pPr>
       <w:r>
+        <w:rPr>
+          <w:color w:val="0B2545"/>
+        </w:rPr>
         <w:t>Church / Faith Group First Send</w:t>
       </w:r>
     </w:p>
@@ -160,6 +187,9 @@
         <w:pStyle w:val="Heading1"/>
       </w:pPr>
       <w:r>
+        <w:rPr>
+          <w:color w:val="0B2545"/>
+        </w:rPr>
         <w:t>School / Youth Organisation First Send</w:t>
       </w:r>
     </w:p>
@@ -290,6 +320,9 @@
         <w:pStyle w:val="Heading1"/>
       </w:pPr>
       <w:r>
+        <w:rPr>
+          <w:color w:val="0B2545"/>
+        </w:rPr>
         <w:t>NGO / Charity / Community Organisation First Send</w:t>
       </w:r>
     </w:p>
@@ -436,6 +469,9 @@
         <w:pStyle w:val="Heading1"/>
       </w:pPr>
       <w:r>
+        <w:rPr>
+          <w:color w:val="0B2545"/>
+        </w:rPr>
         <w:t>Cooperative / Market / Business Network First Send</w:t>
       </w:r>
     </w:p>
@@ -590,6 +626,9 @@
         <w:pStyle w:val="Heading1"/>
       </w:pPr>
       <w:r>
+        <w:rPr>
+          <w:color w:val="0B2545"/>
+        </w:rPr>
         <w:t>Family / Diaspora / Association First Send</w:t>
       </w:r>
     </w:p>
@@ -748,13 +787,55 @@
       </w:r>
     </w:p>
     <w:sectPr>
+      <w:headerReference w:type="default" r:id="rId9"/>
+      <w:footerReference w:type="default" r:id="rId10"/>
       <w:pgSz w:w="12240" w:h="15840"/>
-      <w:pgMar w:top="936" w:right="1008" w:bottom="936" w:left="1008" w:header="720" w:footer="720" w:gutter="0"/>
+      <w:pgMar w:top="1080" w:right="1152" w:bottom="1080" w:left="1152" w:header="720" w:footer="720" w:gutter="0"/>
       <w:cols w:space="720"/>
       <w:docGrid w:linePitch="360"/>
     </w:sectPr>
   </w:body>
 </w:document>
+</file>
+
+<file path=word/footer1.xml><?xml version="1.0" encoding="utf-8"?>
+<w:ftr xmlns:m="http://schemas.openxmlformats.org/officeDocument/2006/math" xmlns:mc="http://schemas.openxmlformats.org/markup-compatibility/2006" xmlns:mo="http://schemas.microsoft.com/office/mac/office/2008/main" xmlns:mv="urn:schemas-microsoft-com:mac:vml" xmlns:o="urn:schemas-microsoft-com:office:office" xmlns:r="http://schemas.openxmlformats.org/officeDocument/2006/relationships" xmlns:v="urn:schemas-microsoft-com:vml" xmlns:w10="urn:schemas-microsoft-com:office:word" xmlns:w14="http://schemas.microsoft.com/office/word/2010/wordml" xmlns:w="http://schemas.openxmlformats.org/wordprocessingml/2006/main" xmlns:wne="http://schemas.microsoft.com/office/word/2006/wordml" xmlns:wp14="http://schemas.microsoft.com/office/word/2010/wordprocessingDrawing" xmlns:wp="http://schemas.openxmlformats.org/drawingml/2006/wordprocessingDrawing" xmlns:wpc="http://schemas.microsoft.com/office/word/2010/wordprocessingCanvas" xmlns:wpg="http://schemas.microsoft.com/office/word/2010/wordprocessingGroup" xmlns:wpi="http://schemas.microsoft.com/office/word/2010/wordprocessingInk" xmlns:wps="http://schemas.microsoft.com/office/word/2010/wordprocessingShape" mc:Ignorable="w14 wp14">
+  <w:p>
+    <w:pPr>
+      <w:pStyle w:val="Footer"/>
+      <w:jc w:val="center"/>
+    </w:pPr>
+    <w:r>
+      <w:t xml:space="preserve">GSN Original Community Setup Material | Source-controlled in gmfn_mvp/docs | Document date: 2026-09-14 | Page </w:t>
+    </w:r>
+    <w:fldSimple w:instr="PAGE"/>
+  </w:p>
+</w:ftr>
+</file>
+
+<file path=word/header1.xml><?xml version="1.0" encoding="utf-8"?>
+<w:hdr xmlns:m="http://schemas.openxmlformats.org/officeDocument/2006/math" xmlns:mc="http://schemas.openxmlformats.org/markup-compatibility/2006" xmlns:mo="http://schemas.microsoft.com/office/mac/office/2008/main" xmlns:mv="urn:schemas-microsoft-com:mac:vml" xmlns:o="urn:schemas-microsoft-com:office:office" xmlns:r="http://schemas.openxmlformats.org/officeDocument/2006/relationships" xmlns:v="urn:schemas-microsoft-com:vml" xmlns:w10="urn:schemas-microsoft-com:office:word" xmlns:w14="http://schemas.microsoft.com/office/word/2010/wordml" xmlns:w="http://schemas.openxmlformats.org/wordprocessingml/2006/main" xmlns:wne="http://schemas.microsoft.com/office/word/2006/wordml" xmlns:wp14="http://schemas.microsoft.com/office/word/2010/wordprocessingDrawing" xmlns:wp="http://schemas.openxmlformats.org/drawingml/2006/wordprocessingDrawing" xmlns:wpc="http://schemas.microsoft.com/office/word/2010/wordprocessingCanvas" xmlns:wpg="http://schemas.microsoft.com/office/word/2010/wordprocessingGroup" xmlns:wpi="http://schemas.microsoft.com/office/word/2010/wordprocessingInk" xmlns:wps="http://schemas.microsoft.com/office/word/2010/wordprocessingShape" mc:Ignorable="w14 wp14">
+  <w:p>
+    <w:pPr>
+      <w:pStyle w:val="Header"/>
+      <w:jc w:val="right"/>
+    </w:pPr>
+    <w:r>
+      <w:t>GSN Community Setup Pack | 2026-09-14</w:t>
+    </w:r>
+  </w:p>
+  <w:p>
+    <w:r>
+      <w:pict>
+        <v:shape id="GSNCommunitySetupWatermark" o:spid="_x0000_s1025" type="#_x0000_t136" style="position:absolute;margin-left:0;margin-top:0;width:468pt;height:468pt;rotation:315;z-index:-251654144;mso-position-horizontal:center;mso-position-vertical:center;mso-wrap-edited:f;" fillcolor="#C9CED6" stroked="f">
+          <v:fill opacity="0.12"/>
+          <v:textpath style="font-family:&quot;Aptos&quot;;font-size:1pt" string="GSN ORIGINAL | 2026-09-14"/>
+          <v:path textpathok="t"/>
+        </v:shape>
+      </w:pict>
+    </w:r>
+  </w:p>
+</w:hdr>
 </file>
 
 <file path=word/numbering.xml><?xml version="1.0" encoding="utf-8"?>

</xml_diff>